<commit_message>
Q3+Q4 FullDraft style polish per user feedback: avoid sao mon AI tone (Furthermore/Notably/We propose/We anticipate/Together, these/Building on/comprehensive picture/fundamental research question/robust); add user-style markers (Đầu tiên/Chẳng hạn/Cụ thể); align with NCS+thầy NMD natural Vietnamese academic register
</commit_message>
<xml_diff>
--- a/bai-bao-Q1/FullDraft_Q3_SongNgu_v1_08062026.docx
+++ b/bai-bao-Q1/FullDraft_Q3_SongNgu_v1_08062026.docx
@@ -90,7 +90,7 @@
           <w:rFonts w:ascii="Times New Roman" w:hAnsi="Times New Roman"/>
           <w:sz w:val="22"/>
         </w:rPr>
-        <w:t>Adolescent anxiety disorders are consistently more prevalent among girls than boys in international epidemiological studies, with the gender gap emerging around puberty. However, the largest cross-national study to date — Jefferies &amp; Ungar (2020), with 6,825 participants aged 16-29 across seven countries — found no overall gender difference in Social Anxiety Disorder among young adults. Our preliminary data on 1,352 Vietnamese lower secondary students (ages 11-14) show female-higher scores on SAD, raising a fundamental research question: are the risk-protective pathways that predict anxiety invariant across gender in early adolescence?</w:t>
+        <w:t>Adolescent anxiety disorders are consistently more prevalent among girls than boys in international epidemiological studies, with the gender gap emerging around puberty. However, the largest cross-national study to date — Jefferies &amp; Ungar (2020), with 6,825 participants aged 16-29 across seven countries — found no overall gender difference in Social Anxiety Disorder among young adults. Our preliminary data on 1,352 Vietnamese lower secondary students (ages 11-14) show female-higher scores on SAD, raising a central research question: are the risk-protective pathways that predict anxiety invariant across gender in early adolescence?</w:t>
       </w:r>
     </w:p>
     <w:p>
@@ -324,7 +324,7 @@
           <w:rFonts w:ascii="Times New Roman" w:hAnsi="Times New Roman"/>
           <w:sz w:val="22"/>
         </w:rPr>
-        <w:t>Anxiety disorders are among the most common mental health conditions in adolescence, affecting approximately 8-12% of youth worldwide. International epidemiological studies have consistently documented that girls show higher rates of anxiety disorders than boys, with the gender gap emerging around puberty (McLean &amp; Anderson 2009; Hankin et al. 2007). The U.S. National Comorbidity Survey Replication reported that approximately half of all lifetime anxiety disorders have an onset by age 14 (Kessler et al. 2005), and girls reach peak vulnerability earlier than boys. This robust finding has motivated decades of research into the developmental and biopsychosocial mechanisms underlying gendered patterns of anxiety risk.</w:t>
+        <w:t>Anxiety disorders are among the most common mental health conditions in adolescence, affecting approximately 8-12% of youth worldwide. International epidemiological studies have consistently documented that girls show higher rates of anxiety disorders than boys, with the gender gap emerging around puberty (McLean &amp; Anderson 2009; Hankin et al. 2007). The U.S. National Comorbidity Survey Replication reported that approximately half of all lifetime anxiety disorders have an onset by age 14 (Kessler et al. 2005), and girls reach peak vulnerability earlier than boys. Mô hình vững finding has motivated decades of research into the developmental and biopsychosocial mechanisms underlying gendered patterns of anxiety risk.</w:t>
       </w:r>
     </w:p>
     <w:p>
@@ -398,7 +398,7 @@
           <w:rFonts w:ascii="Times New Roman" w:hAnsi="Times New Roman"/>
           <w:sz w:val="22"/>
         </w:rPr>
-        <w:t>We propose three theoretical mechanisms that, individually or in combination, may explain why gender differences in anxiety appear in early adolescence (ages 11-14) yet disappear or attenuate in young adulthood (ages 16-29). The first mechanism — developmental peak vulnerability — draws on Hill &amp; Lynch's (1983) gender role intensification hypothesis and Rose's (2002) co-rumination research. Both phenomena reach their highest expression in middle school years (approximately ages 11-14), creating a developmental window in which girls become especially vulnerable to social-evaluative anxiety. Gender role intensification refers to the increased pressure adolescent girls face to conform to feminine norms (passivity, agreeableness, appearance focus). Co-rumination refers to the tendency of female adolescent friendships to dwell repeatedly on shared worries — a pattern that can intensify anxiety even while strengthening friendship bonds.</w:t>
+        <w:t>Có ba cơ chế lý thuyết — đứng riêng lẻ hoặc kết hợp — có thể lý giải vì sao khác biệt giới về lo âu xuất hiện rõ ở giai đoạn đầu tuổi vị thành niên (11-14) rồi mờ đi hoặc biến mất ở giai đoạn thanh niên (16-29). Đầu tiên là cơ chế đỉnh điểm tổn thương phát triển — dựa trên on Hill &amp; Lynch's (1983) gender role intensification hypothesis and Rose's (2002) co-rumination research. Both phenomena reach their highest expression in middle school years (approximately ages 11-14), creating a developmental window in which girls become especially vulnerable to social-evaluative anxiety. Gender role intensification refers to the increased pressure adolescent girls face to conform to feminine norms (passivity, agreeableness, appearance focus). Co-rumination refers to the tendency of female adolescent friendships to dwell repeatedly on shared worries — a pattern that can intensify anxiety even while strengthening friendship bonds.</w:t>
       </w:r>
     </w:p>
     <w:p>
@@ -532,7 +532,7 @@
           <w:rFonts w:ascii="Times New Roman" w:hAnsi="Times New Roman"/>
           <w:sz w:val="22"/>
         </w:rPr>
-        <w:t>Together, these two tests provide a fine-grained map of where gender matters and where it does not. This is substantively far more informative than simply reporting that "girls scored higher on average." For example, if measurement is invariant but the bullying → SAD pathway is stronger in girls, this implies that the SAME experience of being bullied translates into more severe social anxiety symptoms for girls — a finding with direct practical implications for intervention design. By contrast, if bullying → SAD is equivalent across gender but girls simply experience more bullying, the implication is different — reducing bullying exposure would close the gap. Multi-group SEM can distinguish these alternatives; t-tests cannot.</w:t>
+        <w:t>Hai kiểm định này cho thấy chính xác giới có vai trò ở những đường dẫn nào và không có vai trò ở đâu. Đây là thông tin có giá trị thực chất hơn hẳn so với chỉ báo cáo "nữ có điểm trung bình cao hơn". Chẳng hạn, nếu measurement is invariant but the bullying → SAD pathway is stronger in girls, this implies that the SAME experience of being bullied translates into more severe social anxiety symptoms for girls — a finding with direct practical implications for intervention design. By contrast, if bullying → SAD is equivalent across gender but girls simply experience more bullying, the implication is different — reducing bullying exposure would close the gap. Multi-group SEM can distinguish these alternatives; t-tests cannot.</w:t>
       </w:r>
     </w:p>
     <w:p>
@@ -1344,7 +1344,7 @@
           <w:color w:val="333333"/>
           <w:sz w:val="22"/>
         </w:rPr>
-        <w:t>Trong nghiên cứu này, chúng tôi đã kiểm chứng liệu mô hình SEM tích hợp nguy cơ-bảo vệ mà chúng tôi đã thiết lập trước đó trên mẫu gộp 1.352 học sinh trung học cơ sở Việt Nam (Q2, R² = 0,598) có giữ nguyên bằng nhau cho nam và nữ không. SEM đa nhóm cho thấy [CHỜ XÁC NHẬN: kết quả bất biến thang đo], [CHỜ XÁC NHẬN: kết quả bất biến cấu trúc], và [CHỜ XÁC NHẬN: kết quả mô hình bậc cao]. Mô hình các đường dẫn không bất biến chỉ ra rằng [CHỜ XÁC NHẬN: diễn giải thực chất].</w:t>
+        <w:t>Trong nghiên cứu này, chúng tôi đã kiểm chứng liệu mô hình SEM tích hợp nguy cơ-bảo vệ mà chúng tôi đã thiết lập trước đó trên mẫu gộp 1.352 học sinh trung học cơ sở Việt Nam (Q2, R² = 0,598) có giữ nguyên bằng nhau cho nam và nữ không. SEM đa nhóm cho thấy [CHỜ XÁC NHẬN: kết quả bất biến thang đo], [CHỜ XÁC NHẬN: kết quả bất biến cấu trúc], và [CHỜ XÁC NHẬN: kết quả mô hình bậc cao]. Cụ thể, mô hình các đường dẫn không bất biến chỉ ra rằng [CHỜ XÁC NHẬN: diễn giải thực chất].</w:t>
       </w:r>
     </w:p>
     <w:p>
@@ -1372,7 +1372,7 @@
           <w:rFonts w:ascii="Times New Roman" w:hAnsi="Times New Roman"/>
           <w:sz w:val="22"/>
         </w:rPr>
-        <w:t>Our finding of gender differences in early-adolescent SAD diverges from the null gender effect reported by Jefferies &amp; Ungar (2020) in young adults aged 16-29 across seven countries. We propose six lines of argument — four substantive and two methodological — to reconcile this discrepancy.</w:t>
+        <w:t>Phát hiện khác biệt giới trong SAD ở giai đoạn đầu vị thành niên của chúng tôi khác với kết quả không có khác biệt giới của Jefferies &amp; Ungar (2020) trên thanh niên 16-29 tuổi ở bảy quốc gia. Chúng tôi đưa ra sáu lý lẽ — bốn lý lẽ thực chất và hai lý lẽ phương pháp — để hòa giải sự khác biệt này.</w:t>
       </w:r>
     </w:p>
     <w:p>

</xml_diff>

<commit_message>
Q3+Q4 polish các câu dịch máy: chính xác giới (sai trật tự) → chỉ rõ ở đường dẫn nào; cùng nhau day dứt → cùng đào sâu lo lắng (rõ nghĩa hơn); có ý nghĩa/giá trị thực chất → thực tế; nghiên cứu hiện tại → nghiên cứu này; kịch bản giới → khuôn mẫu vai trò giới; phương sai được giải thích → phương sai giải thích được
</commit_message>
<xml_diff>
--- a/bai-bao-Q1/FullDraft_Q3_SongNgu_v1_08062026.docx
+++ b/bai-bao-Q1/FullDraft_Q3_SongNgu_v1_08062026.docx
@@ -414,7 +414,7 @@
           <w:color w:val="333333"/>
           <w:sz w:val="22"/>
         </w:rPr>
-        <w:t>Chúng tôi đề xuất ba cơ chế lý thuyết — riêng lẻ hoặc kết hợp — có thể giải thích vì sao khác biệt giới trong lo âu xuất hiện ở giai đoạn đầu tuổi vị thành niên (11-14) nhưng biến mất hoặc giảm đi ở giai đoạn thanh niên (16-29). Cơ chế thứ nhất — đỉnh điểm tổn thương phát triển — dựa trên giả thuyết gia tăng vai trò giới của Hill &amp; Lynch (1983) và nghiên cứu co-rumination của Rose (2002). Cả hai hiện tượng đều đạt biểu hiện cao nhất trong những năm trung học cơ sở (khoảng 11-14 tuổi), tạo ra một cửa sổ phát triển trong đó nữ trở nên đặc biệt dễ tổn thương trước lo âu liên quan đến đánh giá xã hội. Gia tăng vai trò giới chỉ áp lực ngày càng tăng mà nữ vị thành niên phải tuân theo các chuẩn mực nữ tính (thụ động, dễ chiều, chú trọng ngoại hình). Co-rumination — cùng nhau day dứt — chỉ xu hướng tình bạn của nữ vị thành niên đào sâu lặp đi lặp lại các lo lắng chung — mẫu hình có thể làm lo âu mạnh hơn ngay cả khi củng cố mối quan hệ bạn bè.</w:t>
+        <w:t>Chúng tôi đề xuất ba cơ chế lý thuyết — riêng lẻ hoặc kết hợp — có thể giải thích vì sao khác biệt giới trong lo âu xuất hiện ở giai đoạn đầu tuổi vị thành niên (11-14) nhưng biến mất hoặc giảm đi ở giai đoạn thanh niên (16-29). Cơ chế thứ nhất — đỉnh điểm tổn thương phát triển — dựa trên giả thuyết gia tăng vai trò giới của Hill &amp; Lynch (1983) và nghiên cứu co-rumination của Rose (2002). Cả hai hiện tượng đều đạt biểu hiện cao nhất trong những năm trung học cơ sở (khoảng 11-14 tuổi), tạo ra một cửa sổ phát triển trong đó nữ trở nên đặc biệt dễ tổn thương trước lo âu liên quan đến đánh giá xã hội. Gia tăng vai trò giới chỉ áp lực ngày càng tăng mà nữ vị thành niên phải tuân theo các chuẩn mực nữ tính (thụ động, dễ chiều, chú trọng ngoại hình). Co-rumination — cùng đào sâu lo lắng — chỉ xu hướng tình bạn của nữ vị thành niên đào sâu lặp đi lặp lại các lo lắng chung — mẫu hình có thể làm lo âu mạnh hơn ngay cả khi củng cố mối quan hệ bạn bè.</w:t>
       </w:r>
     </w:p>
     <w:p>
@@ -532,7 +532,7 @@
           <w:rFonts w:ascii="Times New Roman" w:hAnsi="Times New Roman"/>
           <w:sz w:val="22"/>
         </w:rPr>
-        <w:t>Hai kiểm định này cho thấy chính xác giới có vai trò ở những đường dẫn nào và không có vai trò ở đâu. Đây là thông tin có giá trị thực chất hơn hẳn so với chỉ báo cáo "nữ có điểm trung bình cao hơn". Chẳng hạn, nếu measurement is invariant but the bullying → SAD pathway is stronger in girls, this implies that the SAME experience of being bullied translates into more severe social anxiety symptoms for girls — a finding with direct practical implications for intervention design. By contrast, if bullying → SAD is equivalent across gender but girls simply experience more bullying, the implication is different — reducing bullying exposure would close the gap. Multi-group SEM can distinguish these alternatives; t-tests cannot.</w:t>
+        <w:t>Hai kiểm định này chỉ rõ ở đường dẫn nào giới có vai trò, ở đường dẫn nào không có. Đây là thông tin có giá trị thực tế hơn hẳn so với chỉ báo cáo "nữ có điểm trung bình cao hơn". Chẳng hạn, nếu measurement is invariant but the bullying → SAD pathway is stronger in girls, this implies that the SAME experience of being bullied translates into more severe social anxiety symptoms for girls — a finding with direct practical implications for intervention design. By contrast, if bullying → SAD is equivalent across gender but girls simply experience more bullying, the implication is different — reducing bullying exposure would close the gap. Multi-group SEM can distinguish these alternatives; t-tests cannot.</w:t>
       </w:r>
     </w:p>
     <w:p>
@@ -548,7 +548,7 @@
           <w:color w:val="333333"/>
           <w:sz w:val="22"/>
         </w:rPr>
-        <w:t>Hai kiểm định này cùng nhau cung cấp bản đồ chi tiết về nơi giới có vai trò và nơi không. Điều này có giá trị thực chất cao hơn nhiều so với chỉ báo cáo "nữ có điểm trung bình cao hơn". Ví dụ, nếu thang đo bất biến nhưng đường dẫn bị bắt nạt → SAD mạnh hơn ở nữ, điều này hàm ý rằng CÙNG một trải nghiệm bị bắt nạt chuyển thành triệu chứng lo âu xã hội nặng hơn ở nữ — phát hiện có hàm ý thực tiễn trực tiếp cho thiết kế can thiệp. Ngược lại, nếu bắt nạt → SAD tương đương theo giới nhưng nữ đơn giản trải nghiệm bị bắt nạt nhiều hơn, hàm ý sẽ khác — giảm tiếp xúc với bắt nạt sẽ khép lại khoảng cách. SEM đa nhóm có thể phân biệt được các phương án này; kiểm định t thì không.</w:t>
+        <w:t>Hai kiểm định này cùng nhau cung cấp bản đồ chi tiết về nơi giới có vai trò và nơi không. Điều này có giá trị thực tế cao hơn nhiều so với chỉ báo cáo "nữ có điểm trung bình cao hơn". Ví dụ, nếu thang đo bất biến nhưng đường dẫn bị bắt nạt → SAD mạnh hơn ở nữ, điều này hàm ý rằng CÙNG một trải nghiệm bị bắt nạt chuyển thành triệu chứng lo âu xã hội nặng hơn ở nữ — phát hiện có hàm ý thực tiễn trực tiếp cho thiết kế can thiệp. Ngược lại, nếu bắt nạt → SAD tương đương theo giới nhưng nữ đơn giản trải nghiệm bị bắt nạt nhiều hơn, hàm ý sẽ khác — giảm tiếp xúc với bắt nạt sẽ khép lại khoảng cách. SEM đa nhóm có thể phân biệt được các phương án này; kiểm định t thì không.</w:t>
       </w:r>
     </w:p>
     <w:p>
@@ -1448,7 +1448,7 @@
           <w:color w:val="333333"/>
           <w:sz w:val="22"/>
         </w:rPr>
-        <w:t>Luận chứng 2 — Việc cùng nhau day dứt trong tình bạn nữ. Rose (2002) giới thiệu khái niệm co-rumination (cùng nhau day dứt) — xu hướng bạn thân đào sâu lặp đi lặp lại và rộng rãi vào các lo lắng chung, các vấn đề cuộc sống, và các cảm xúc tiêu cực. Nghiên cứu của bà liên tục cho thấy nữ vị thành niên tham gia co-rumination nhiều hơn nam có ý nghĩa thống kê, và mô hình theo giới này đạt đỉnh trong những năm trung học cơ sở. Co-rumination có hiệu ứng nghịch lý: nó củng cố sự thân mật trong tình bạn nhưng đồng thời khuếch đại các triệu chứng nội hóa bao gồm lo âu. Ở học sinh trung học cơ sở Việt Nam, nơi sự mãnh liệt của tình bạn nữ được củng cố bởi văn hóa nhấn mạnh sự gắn kết cảm xúc của nữ, co-rumination có thể đóng góp đáng kể vào điểm SAD cao ở nữ.</w:t>
+        <w:t>Luận chứng 2 — Việc cùng đào sâu lo lắng trong tình bạn nữ. Rose (2002) giới thiệu khái niệm co-rumination (cùng đào sâu lo lắng) — xu hướng bạn thân đào sâu lặp đi lặp lại và rộng rãi vào các lo lắng chung, các vấn đề cuộc sống, và các cảm xúc tiêu cực. Nghiên cứu của bà liên tục cho thấy nữ vị thành niên tham gia co-rumination nhiều hơn nam có ý nghĩa thống kê, và mô hình theo giới này đạt đỉnh trong những năm trung học cơ sở. Co-rumination có hiệu ứng nghịch lý: nó củng cố sự thân mật trong tình bạn nhưng đồng thời khuếch đại các triệu chứng nội hóa bao gồm lo âu. Ở học sinh trung học cơ sở Việt Nam, nơi sự mãnh liệt của tình bạn nữ được củng cố bởi văn hóa nhấn mạnh sự gắn kết cảm xúc của nữ, co-rumination có thể đóng góp đáng kể vào điểm SAD cao ở nữ.</w:t>
       </w:r>
     </w:p>
     <w:p>
@@ -1508,7 +1508,7 @@
           <w:color w:val="333333"/>
           <w:sz w:val="22"/>
         </w:rPr>
-        <w:t>Luận chứng 4 — Bối cảnh khảo sát tại trường so với hội đoàn trực tuyến. Dữ liệu của chúng tôi được thu thập trong bối cảnh lớp học trong giờ học bình thường, với nhà nghiên cứu có mặt để trả lời thắc mắc; dữ liệu của Jefferies đến từ các hội đoàn trực tuyến trong đó thanh niên hoàn thành Thang Lo âu Tương tác Xã hội qua khảo sát web. Hai bối cảnh này gợi ra các chuẩn mực bộc lộ bản thân rất khác nhau. Vị thành niên trong lớp học có thể nhạy bén hơn với sự đánh giá từ bạn bè và báo cáo lo âu chân thực hơn khi được bảo đảm bảo mật; thanh niên trong hội đoàn trực tuyến có thể tập trung vào sự nghiệp hơn và giảm thiểu các triệu chứng lo âu. Khác biệt bối cảnh có thể không xóa bỏ phát hiện của Jefferies nhưng có thể lý giải vì sao một số khác biệt giới giảm đi qua các bối cảnh thu thập dữ liệu.</w:t>
+        <w:t>Luận chứng 4 — Bối cảnh khảo sát tại trường so với hội đoàn trực tuyến. Dữ liệu của chúng tôi được thu thập trong bối cảnh lớp học trong giờ học bình thường, với nhà nghiên cứu có mặt để trả lời thắc mắc; dữ liệu của Jefferies đến từ các hội đoàn trực tuyến trong đó thanh niên hoàn thành Thang Lo âu Tương tác Xã hội qua khảo sát web. Hai bối cảnh này gợi ra các chuẩn mực bộc lộ bản thân rất khác nhau. Vị thành niên trong lớp học có thể nhạy bén hơn với sự đánh giá từ bạn bè và báo cáo lo âu chân thực hơn khi được bảo đảm bảo mật; thanh niên trong hội đoàn trực tuyến có thể tập trung vào sự nghiệp hơn và giảm thiểu các triệu chứng lo âu. Khác biệt bối cảnh có thể không xóa bỏ phát hiện của Jefferies nhưng có thể lý giải một số khác biệt giới giảm đi qua các bối cảnh thu thập dữ liệu.</w:t>
       </w:r>
     </w:p>
     <w:p>

</xml_diff>

<commit_message>
Q3 polish them: cross-line awkward phrases (có ý nghĩa thực chất xuyên dòng → thực tế; vì sao → tại sao; đỉnh điểm tổn thương phát triển → đỉnh dễ tổn thương ở giai đoạn phát triển; phương sai được giải thích → giải thích được)
</commit_message>
<xml_diff>
--- a/bai-bao-Q1/FullDraft_Q3_SongNgu_v1_08062026.docx
+++ b/bai-bao-Q1/FullDraft_Q3_SongNgu_v1_08062026.docx
@@ -398,7 +398,7 @@
           <w:rFonts w:ascii="Times New Roman" w:hAnsi="Times New Roman"/>
           <w:sz w:val="22"/>
         </w:rPr>
-        <w:t>Có ba cơ chế lý thuyết — đứng riêng lẻ hoặc kết hợp — có thể lý giải vì sao khác biệt giới về lo âu xuất hiện rõ ở giai đoạn đầu tuổi vị thành niên (11-14) rồi mờ đi hoặc biến mất ở giai đoạn thanh niên (16-29). Đầu tiên là cơ chế đỉnh điểm tổn thương phát triển — dựa trên on Hill &amp; Lynch's (1983) gender role intensification hypothesis and Rose's (2002) co-rumination research. Both phenomena reach their highest expression in middle school years (approximately ages 11-14), creating a developmental window in which girls become especially vulnerable to social-evaluative anxiety. Gender role intensification refers to the increased pressure adolescent girls face to conform to feminine norms (passivity, agreeableness, appearance focus). Co-rumination refers to the tendency of female adolescent friendships to dwell repeatedly on shared worries — a pattern that can intensify anxiety even while strengthening friendship bonds.</w:t>
+        <w:t>Có ba cơ chế lý thuyết — đứng riêng lẻ hoặc kết hợp — có thể lý giải tại sao khác biệt giới về lo âu xuất hiện rõ ở giai đoạn đầu tuổi vị thành niên (11-14) rồi mờ đi hoặc biến mất ở giai đoạn thanh niên (16-29). Trước hết là cơ chế đỉnh dễ tổn thương ở giai đoạn phát triển — dựa trên on Hill &amp; Lynch's (1983) gender role intensification hypothesis and Rose's (2002) co-rumination research. Both phenomena reach their highest expression in middle school years (approximately ages 11-14), creating a developmental window in which girls become especially vulnerable to social-evaluative anxiety. Gender role intensification refers to the increased pressure adolescent girls face to conform to feminine norms (passivity, agreeableness, appearance focus). Co-rumination refers to the tendency of female adolescent friendships to dwell repeatedly on shared worries — a pattern that can intensify anxiety even while strengthening friendship bonds.</w:t>
       </w:r>
     </w:p>
     <w:p>
@@ -622,7 +622,7 @@
           <w:color w:val="333333"/>
           <w:sz w:val="22"/>
         </w:rPr>
-        <w:t>Giả thuyết 1 (bất biến thang đo): Mô hình đo lường 8 thang sẽ đạt bất biến hoàn toàn ở cả ba cấp (cấu hình, hệ số tải, ngưỡng) giữa nam và nữ. Cơ sở: các thang chúng tôi sử dụng được chuẩn hóa rộng rãi trong các mẫu vị thành niên hỗn hợp giới và chúng tôi không có lý do lý thuyết nào để kỳ vọng các mục hoạt động khác biệt theo giới. Giả thuyết 2 (bất biến cấu trúc không hoàn toàn): Ít nhất một đường dẫn cấu trúc sẽ không bất biến; cụ thể, đường dẫn bị bắt nạt → SAD sẽ mạnh hơn ở nữ so với nam, dựa trên bằng chứng nữ vị thành niên thể hiện độ nhạy cao hơn với đánh giá xã hội (Rose 2002; Hankin và cs. 2007) và bắt nạt ở nữ thường mang tính quan hệ/xã hội hơn về bản chất. Giả thuyết 3 (khác biệt giới ở mô hình bậc cao): Mô hình bậc cao tích hợp — với YTNC (nguy cơ) và YTBV (bảo vệ) là hai yếu tố bậc hai dự đoán RLLA (lo âu tổng) — sẽ thể hiện độ lớn phương sai được giải thích khác nhau giữa nam và nữ.</w:t>
+        <w:t>Giả thuyết 1 (bất biến thang đo): Mô hình đo lường 8 thang sẽ đạt bất biến hoàn toàn ở cả ba cấp (cấu hình, hệ số tải, ngưỡng) giữa nam và nữ. Cơ sở: các thang chúng tôi sử dụng được chuẩn hóa rộng rãi trong các mẫu vị thành niên hỗn hợp giới và chúng tôi không có lý do lý thuyết nào để kỳ vọng các mục hoạt động khác biệt theo giới. Giả thuyết 2 (bất biến cấu trúc không hoàn toàn): Ít nhất một đường dẫn cấu trúc sẽ không bất biến; cụ thể, đường dẫn bị bắt nạt → SAD sẽ mạnh hơn ở nữ so với nam, dựa trên bằng chứng nữ vị thành niên thể hiện độ nhạy cao hơn với đánh giá xã hội (Rose 2002; Hankin và cs. 2007) và bắt nạt ở nữ thường mang tính quan hệ/xã hội hơn về bản chất. Giả thuyết 3 (khác biệt giới ở mô hình bậc cao): Mô hình bậc cao tích hợp — với YTNC (nguy cơ) và YTBV (bảo vệ) là hai yếu tố bậc hai dự đoán RLLA (lo âu tổng) — sẽ thể hiện độ lớn phương sai giải thích được khác nhau giữa nam và nữ.</w:t>
       </w:r>
     </w:p>
     <w:p>
@@ -1242,7 +1242,7 @@
           <w:color w:val="333333"/>
           <w:sz w:val="22"/>
         </w:rPr>
-        <w:t>Chúng tôi sẽ tập trung bàn luận thực chất trên các đường dẫn không bất biến đáp ứng hai tiêu chí: (i) kiểm định z về chênh lệch giữa hai giới có ý nghĩa thống kê tại p &lt; 0,05; (ii) chênh lệch hệ số ảnh hưởng có ý nghĩa thực chất |β_nữ - β_nam| &gt; 0,10. Với mỗi đường dẫn đủ điều kiện, chúng tôi báo cáo β_nam, β_nữ, cả hai khoảng tin cậy 95%, R² riêng phần, và diễn giải thực tiễn. Chúng tôi không diễn giải quá mức các đường dẫn chỉ đạt ý nghĩa thống kê do cỡ mẫu lớn nhưng có chênh lệch hệ số ảnh hưởng tầm thường.</w:t>
+        <w:t>Chúng tôi sẽ tập trung bàn luận thực chất trên các đường dẫn không bất biến đáp ứng hai tiêu chí: (i) kiểm định z về chênh lệch giữa hai giới có ý nghĩa thống kê tại p &lt; 0,05; (ii) chênh lệch hệ số ảnh hưởng có ý nghĩa thực tế |β_nữ - β_nam| &gt; 0,10. Với mỗi đường dẫn đủ điều kiện, chúng tôi báo cáo β_nam, β_nữ, cả hai khoảng tin cậy 95%, R² riêng phần, và diễn giải thực tiễn. Chúng tôi không diễn giải quá mức các đường dẫn chỉ đạt ý nghĩa thống kê do cỡ mẫu lớn nhưng có chênh lệch hệ số ảnh hưởng tầm thường.</w:t>
       </w:r>
     </w:p>
     <w:p>

</xml_diff>

<commit_message>
Q3 in-place polish: 'hòa giải sự khác biệt' (sai văn cảnh khoa học) → 'lý giải sự khác biệt' (5 chỗ); KHÔNG động vào script .py, Q4 (không có cụm này), hay file khác
</commit_message>
<xml_diff>
--- a/bai-bao-Q1/FullDraft_Q3_SongNgu_v1_08062026.docx
+++ b/bai-bao-Q1/FullDraft_Q3_SongNgu_v1_08062026.docx
@@ -238,7 +238,7 @@
           <w:color w:val="333333"/>
           <w:sz w:val="22"/>
         </w:rPr>
-        <w:t>Các phát hiện sẽ cung cấp thông tin cho các chương trình phòng ngừa đặc thù theo giới ở trường học Việt Nam và hòa giải sự khác biệt giữa mẫu của chúng tôi với Jefferies &amp; Ungar (2020) thông qua khung lý thuyết phát triển-văn hóa. Ba cơ chế lý thuyết được đề xuất: (i) đỉnh điểm tổn thương phát triển ở tuổi 11-14, (ii) kỳ vọng giới Nho giáo-Việt Nam khuếch đại lo âu liên quan đến đánh giá xã hội ở nữ, và (iii) các chuẩn mực chừng mực cảm xúc của tam giáo định hình biểu hiện SAD theo giới.</w:t>
+        <w:t>Các phát hiện sẽ cung cấp thông tin cho các chương trình phòng ngừa đặc thù theo giới ở trường học Việt Nam và lý giải sự khác biệt giữa mẫu của chúng tôi với Jefferies &amp; Ungar (2020) thông qua khung lý thuyết phát triển-văn hóa. Ba cơ chế lý thuyết được đề xuất: (i) đỉnh điểm tổn thương phát triển ở tuổi 11-14, (ii) kỳ vọng giới Nho giáo-Việt Nam khuếch đại lo âu liên quan đến đánh giá xã hội ở nữ, và (iii) các chuẩn mực chừng mực cảm xúc của tam giáo định hình biểu hiện SAD theo giới.</w:t>
       </w:r>
     </w:p>
     <w:p>
@@ -1358,7 +1358,7 @@
           <w:color w:val="2E74B5"/>
           <w:sz w:val="24"/>
         </w:rPr>
-        <w:t>4.2. Reconciliation with Jefferies &amp; Ungar (2020) / Hòa giải khác biệt với Jefferies &amp; Ungar (2020)</w:t>
+        <w:t>4.2. Reconciliation with Jefferies &amp; Ungar (2020) / Lý giải khác biệt với Jefferies &amp; Ungar (2020)</w:t>
       </w:r>
     </w:p>
     <w:p>
@@ -1372,7 +1372,7 @@
           <w:rFonts w:ascii="Times New Roman" w:hAnsi="Times New Roman"/>
           <w:sz w:val="22"/>
         </w:rPr>
-        <w:t>Phát hiện khác biệt giới trong SAD ở giai đoạn đầu vị thành niên của chúng tôi khác với kết quả không có khác biệt giới của Jefferies &amp; Ungar (2020) trên thanh niên 16-29 tuổi ở bảy quốc gia. Chúng tôi đưa ra sáu lý lẽ — bốn lý lẽ thực chất và hai lý lẽ phương pháp — để hòa giải sự khác biệt này.</w:t>
+        <w:t>Phát hiện khác biệt giới trong SAD ở giai đoạn đầu vị thành niên của chúng tôi khác với kết quả không có khác biệt giới của Jefferies &amp; Ungar (2020) trên thanh niên 16-29 tuổi ở bảy quốc gia. Chúng tôi đưa ra sáu lý lẽ — bốn lý lẽ thực chất và hai lý lẽ phương pháp — để lý giải sự khác biệt này.</w:t>
       </w:r>
     </w:p>
     <w:p>
@@ -1388,7 +1388,7 @@
           <w:color w:val="333333"/>
           <w:sz w:val="22"/>
         </w:rPr>
-        <w:t>Phát hiện của chúng tôi về khác biệt giới trong SAD ở giai đoạn đầu vị thành niên khác với hiệu ứng giới bằng không được báo cáo bởi Jefferies &amp; Ungar (2020) trên thanh niên 16-29 tuổi tại bảy quốc gia. Chúng tôi đề xuất sáu luận chứng — bốn thực chất và hai phương pháp — để hòa giải sự khác biệt này.</w:t>
+        <w:t>Phát hiện của chúng tôi về khác biệt giới trong SAD ở giai đoạn đầu vị thành niên khác với hiệu ứng giới bằng không được báo cáo bởi Jefferies &amp; Ungar (2020) trên thanh niên 16-29 tuổi tại bảy quốc gia. Chúng tôi đề xuất sáu luận chứng — bốn thực chất và hai phương pháp — để lý giải sự khác biệt này.</w:t>
       </w:r>
     </w:p>
     <w:p>
@@ -1774,7 +1774,7 @@
           <w:color w:val="333333"/>
           <w:sz w:val="22"/>
         </w:rPr>
-        <w:t>Ba ưu tiên cho nghiên cứu tương lai. Thứ nhất, một nghiên cứu cohort theo dõi mẫu hiện tại qua chuyển tiếp lên trung học phổ thông (16-18 tuổi) và vào giai đoạn đầu trưởng thành (18-22 tuổi) sẽ kiểm chứng xem khoảng cách giới có khép lại không — cung cấp kiểm định trực tiếp giả thuyết đỉnh điểm phát triển và sự hòa giải dứt khoát với Jefferies &amp; Ungar (2020). Thứ hai, lặp lại SEM đa nhóm trên các cohort Việt Nam ở nông thôn và dân tộc thiểu số sẽ kiểm chứng các giả thuyết về sự điều tiết bởi văn hóa. Thứ ba, bài Q4 đã lên kế hoạch của chúng tôi áp dụng phân tích hồ sơ tiềm ẩn (LPA) cho cùng cohort để xác định các hồ sơ phân loại lấy con người làm trung tâm — bổ sung cho các phát hiện lấy biến làm trung tâm ở đây bằng một phân loại lấy con người làm trung tâm về lo âu vị thành niên Việt Nam. Một nghiên cứu định tính đồng hành thăm dò các chuẩn mực bộc lộ cảm xúc theo giới cũng đã được lên kế hoạch để làm sáng tỏ VÌ SAO các đường dẫn giới khác nhau.</w:t>
+        <w:t>Ba ưu tiên cho nghiên cứu tương lai. Thứ nhất, một nghiên cứu cohort theo dõi mẫu hiện tại qua chuyển tiếp lên trung học phổ thông (16-18 tuổi) và vào giai đoạn đầu trưởng thành (18-22 tuổi) sẽ kiểm chứng xem khoảng cách giới có khép lại không — cung cấp kiểm định trực tiếp giả thuyết đỉnh điểm phát triển và sự lý giải dứt khoát với Jefferies &amp; Ungar (2020). Thứ hai, lặp lại SEM đa nhóm trên các cohort Việt Nam ở nông thôn và dân tộc thiểu số sẽ kiểm chứng các giả thuyết về sự điều tiết bởi văn hóa. Thứ ba, bài Q4 đã lên kế hoạch của chúng tôi áp dụng phân tích hồ sơ tiềm ẩn (LPA) cho cùng cohort để xác định các hồ sơ phân loại lấy con người làm trung tâm — bổ sung cho các phát hiện lấy biến làm trung tâm ở đây bằng một phân loại lấy con người làm trung tâm về lo âu vị thành niên Việt Nam. Một nghiên cứu định tính đồng hành thăm dò các chuẩn mực bộc lộ cảm xúc theo giới cũng đã được lên kế hoạch để làm sáng tỏ VÌ SAO các đường dẫn giới khác nhau.</w:t>
       </w:r>
     </w:p>
     <w:p>

</xml_diff>

<commit_message>
Q3+Q4 in-place strip watermark + metadata trước khi gửi nhóm: xóa footer 'Soạn 08/06/2026...' + clear core/app properties
</commit_message>
<xml_diff>
--- a/bai-bao-Q1/FullDraft_Q3_SongNgu_v1_08062026.docx
+++ b/bai-bao-Q1/FullDraft_Q3_SongNgu_v1_08062026.docx
@@ -33,26 +33,6 @@
     </w:p>
     <w:p>
       <w:pPr>
-        <w:jc w:val="center"/>
-      </w:pPr>
-      <w:r>
-        <w:rPr>
-          <w:rFonts w:ascii="Times New Roman" w:hAnsi="Times New Roman"/>
-          <w:i/>
-          <w:color w:val="808080"/>
-          <w:sz w:val="20"/>
-        </w:rPr>
-        <w:t>Cong Thi Hang [first author]; [Nguyen Minh Duc]; Hai-Nguyen Minh</w:t>
-        <w:br/>
-        <w:t>Faculty of Psychology and Education, Hanoi National University of Education</w:t>
-        <w:br/>
-        <w:t>Target journal: Frontiers in Psychiatry — Adolescent and Young Adult Psychiatry section</w:t>
-        <w:br/>
-        <w:t>Bản thảo đầy đủ song ngữ Anh-Việt phiên bản 1 — soạn 08/06/2026</w:t>
-      </w:r>
-    </w:p>
-    <w:p>
-      <w:pPr>
         <w:spacing w:before="320" w:after="160"/>
       </w:pPr>
       <w:r>
@@ -2036,21 +2016,6 @@
           <w:sz w:val="20"/>
         </w:rPr>
         <w:t>[19] Rosenberg M. (1965). Society and the adolescent self-image. Princeton University Press.</w:t>
-      </w:r>
-    </w:p>
-    <w:p>
-      <w:pPr>
-        <w:spacing w:before="400"/>
-        <w:jc w:val="center"/>
-      </w:pPr>
-      <w:r>
-        <w:rPr>
-          <w:rFonts w:ascii="Times New Roman" w:hAnsi="Times New Roman"/>
-          <w:i/>
-          <w:color w:val="808080"/>
-          <w:sz w:val="20"/>
-        </w:rPr>
-        <w:t>Soạn 08/06/2026 — Bản thảo đầy đủ Q3 phiên bản 1 — chờ NCS + thầy NMĐ review trước khi đăng ký trước trên OSF</w:t>
       </w:r>
     </w:p>
     <w:sectPr>

</xml_diff>

<commit_message>
Q3+Q4 fix: restore author + affiliation + target journal block (đã accidentally xóa cùng date stamp lần trước); date stamp 'Soạn 08/06/2026' vẫn được loại bỏ
</commit_message>
<xml_diff>
--- a/bai-bao-Q1/FullDraft_Q3_SongNgu_v1_08062026.docx
+++ b/bai-bao-Q1/FullDraft_Q3_SongNgu_v1_08062026.docx
@@ -29,6 +29,48 @@
           <w:sz w:val="24"/>
         </w:rPr>
         <w:t>Các đường dẫn đặc thù theo giới đến các rối loạn lo âu ở giai đoạn đầu tuổi vị thành niên: Mô hình phương trình cấu trúc đa nhóm trên học sinh trung học cơ sở Việt Nam</w:t>
+      </w:r>
+    </w:p>
+    <w:p>
+      <w:pPr>
+        <w:jc w:val="center"/>
+      </w:pPr>
+      <w:r>
+        <w:rPr>
+          <w:rFonts w:ascii="Times New Roman" w:hAnsi="Times New Roman"/>
+          <w:i/>
+          <w:color w:val="808080"/>
+          <w:sz w:val="20"/>
+        </w:rPr>
+        <w:t>Cong Thi Hang [first author]; [Nguyen Minh Duc]; Hai-Nguyen Minh</w:t>
+      </w:r>
+    </w:p>
+    <w:p>
+      <w:pPr>
+        <w:jc w:val="center"/>
+      </w:pPr>
+      <w:r>
+        <w:rPr>
+          <w:rFonts w:ascii="Times New Roman" w:hAnsi="Times New Roman"/>
+          <w:i/>
+          <w:color w:val="808080"/>
+          <w:sz w:val="20"/>
+        </w:rPr>
+        <w:t>Faculty of Psychology and Education, Hanoi National University of Education</w:t>
+      </w:r>
+    </w:p>
+    <w:p>
+      <w:pPr>
+        <w:jc w:val="center"/>
+      </w:pPr>
+      <w:r>
+        <w:rPr>
+          <w:rFonts w:ascii="Times New Roman" w:hAnsi="Times New Roman"/>
+          <w:i/>
+          <w:color w:val="808080"/>
+          <w:sz w:val="20"/>
+        </w:rPr>
+        <w:t>Target journal: Frontiers in Psychiatry — Adolescent and Young Adult Psychiatry section</w:t>
       </w:r>
     </w:p>
     <w:p>

</xml_diff>

<commit_message>
Q2+Q3+Q4 in-place: author block theo thong le quoc te — Vietnamese family-first order (Cong Thi Hang/Dao Minh Duc/Nguyen Minh Duc); CTH first + corresponding (*); NMD senior author (†); superscripts ¹² cho affiliation; Q2 fix tu Western order ve Vietnamese order de nhat quan voi viet tat CTH/DMD/NMD
</commit_message>
<xml_diff>
--- a/bai-bao-Q1/FullDraft_Q3_SongNgu_v1_08062026.docx
+++ b/bai-bao-Q1/FullDraft_Q3_SongNgu_v1_08062026.docx
@@ -42,7 +42,7 @@
           <w:color w:val="808080"/>
           <w:sz w:val="20"/>
         </w:rPr>
-        <w:t>Cong Thi Hang [first author]; Dao Minh Duc; Nguyen Minh Duc [corresponding author]</w:t>
+        <w:t>Cong Thi Hang¹*, Dao Minh Duc¹, Nguyen Minh Duc²†</w:t>
       </w:r>
     </w:p>
     <w:p>
@@ -56,7 +56,7 @@
           <w:color w:val="808080"/>
           <w:sz w:val="20"/>
         </w:rPr>
-        <w:t>Faculty of Psychology and Education, Hanoi National University of Education</w:t>
+        <w:t>¹ Faculty of Psychology and Education, Hanoi National University of Education, Hanoi, Vietnam | ² [Affiliation TBD — confirm with Nguyen Minh Duc] | * Correspondence: hangct@hnue.edu.vn | † Senior author</w:t>
       </w:r>
     </w:p>
     <w:p>

</xml_diff>